<commit_message>
Correct over-labeled 'exam' claims in dbt class notes (35-39)
Cross-checked transcripts: the words exam/certification/SnowPro appear nowhere in Classes 33-40.
Trainer's 'they may ask' / '3-4 questions' flags relabeled as interview context.
Added note that Class 37 showed only 1 of the '3 types of incremental' (merge/append/delete+insert/microbatch).
</commit_message>
<xml_diff>
--- a/Snowflake-Classes-21-40-Master-Notes.docx
+++ b/Snowflake-Classes-21-40-Master-Notes.docx
@@ -14614,7 +14614,7 @@
         <w:t>sources.yml</w:t>
       </w:r>
       <w:r>
-        <w:t xml:space="preserve"> — dynamically resolve database/schema (trainer flagged as exam-ish)</w:t>
+        <w:t xml:space="preserve"> — dynamically resolve database/schema (trainer flagged as a likely interview question)</w:t>
       </w:r>
     </w:p>
     <w:p>
@@ -15395,7 +15395,7 @@
         <w:rPr>
           <w:i/>
         </w:rPr>
-        <w:t>End of Class 35 notes. Third dbt class: intermediate/mart layers, sources.yml (dynamic db/schema — trainer flagged as exam-ish), packages.yml + dbt_utils, and surrogate keys (= MD5 hash_key, ties to SCD2). Mostly job skill; the YAML files + surrogate-key/hash connection are the cert-adjacent bits.</w:t>
+        <w:t>End of Class 35 notes. Third dbt class: intermediate/mart layers, sources.yml (dynamic db/schema — trainer flagged as a likely interview question), packages.yml + dbt_utils, and surrogate keys (= MD5 hash_key, ties to SCD2). Mostly job skill; the YAML files + surrogate-key/hash connection are the cert-adjacent bits.</w:t>
       </w:r>
     </w:p>
     <w:p>
@@ -15493,28 +15493,19 @@
         <w:rPr>
           <w:b/>
         </w:rPr>
-        <w:t>⭐ EXPLICIT EXAM SIGNAL (rare — he almost never does this):</w:t>
-      </w:r>
-      <w:r>
-        <w:t xml:space="preserve"> at the end he said the </w:t>
-      </w:r>
-      <w:r>
-        <w:rPr>
-          <w:b/>
-        </w:rPr>
-        <w:t>next class is on incremental models</w:t>
-      </w:r>
-      <w:r>
-        <w:t xml:space="preserve">, that there are </w:t>
-      </w:r>
-      <w:r>
-        <w:rPr>
-          <w:b/>
-        </w:rPr>
-        <w:t>"three different types of incremental,"</w:t>
-      </w:r>
-      <w:r>
-        <w:t xml:space="preserve"> and — his exact words — </w:t>
+        <w:t>⭐ Trainer flag (CORRECTED):</w:t>
+      </w:r>
+      <w:r>
+        <w:t xml:space="preserve"> at the end he said there are </w:t>
+      </w:r>
+      <w:r>
+        <w:rPr>
+          <w:b/>
+        </w:rPr>
+        <w:t>"three different types of incremental"</w:t>
+      </w:r>
+      <w:r>
+        <w:t xml:space="preserve"> and </w:t>
       </w:r>
       <w:r>
         <w:rPr>
@@ -15523,25 +15514,97 @@
         <w:t>"this is very important, at least you will find three to four questions from the same topic."</w:t>
       </w:r>
       <w:r>
-        <w:t xml:space="preserve"> So </w:t>
-      </w:r>
-      <w:r>
-        <w:rPr>
-          <w:b/>
-        </w:rPr>
-        <w:t>incremental / incremental loading is worth real study time</w:t>
-      </w:r>
-      <w:r>
-        <w:t xml:space="preserve"> for the exam. Full detail comes in </w:t>
-      </w:r>
-      <w:r>
-        <w:rPr>
-          <w:b/>
-        </w:rPr>
-        <w:t>Class 37</w:t>
-      </w:r>
-      <w:r>
-        <w:t xml:space="preserve">. </w:t>
+        <w:t xml:space="preserve"> ⚠️ </w:t>
+      </w:r>
+      <w:r>
+        <w:rPr>
+          <w:i/>
+        </w:rPr>
+        <w:t xml:space="preserve">Correction: he did </w:t>
+      </w:r>
+      <w:r>
+        <w:rPr>
+          <w:i/>
+        </w:rPr>
+        <w:t>not</w:t>
+      </w:r>
+      <w:r>
+        <w:rPr>
+          <w:i/>
+        </w:rPr>
+        <w:t xml:space="preserve"> say "exam" — the words exam/certification/SnowPro appear </w:t>
+      </w:r>
+      <w:r>
+        <w:rPr>
+          <w:i/>
+        </w:rPr>
+        <w:t>nowhere</w:t>
+      </w:r>
+      <w:r>
+        <w:rPr>
+          <w:i/>
+        </w:rPr>
+        <w:t xml:space="preserve"> in Classes 33–40. In a dbt class this most likely means </w:t>
+      </w:r>
+      <w:r>
+        <w:rPr>
+          <w:i/>
+        </w:rPr>
+        <w:t>interview questions</w:t>
+      </w:r>
+      <w:r>
+        <w:rPr>
+          <w:i/>
+        </w:rPr>
+        <w:t>. The plain-Snowflake part (watermark + MERGE) still overlaps the exam; the dbt incremental part is interview material.</w:t>
+      </w:r>
+      <w:r>
+        <w:t xml:space="preserve"> Also: Class 37 only demonstrated </w:t>
+      </w:r>
+      <w:r>
+        <w:rPr>
+          <w:b/>
+        </w:rPr>
+        <w:t>one</w:t>
+      </w:r>
+      <w:r>
+        <w:t xml:space="preserve"> strategy (merge); the standard dbt-on-Snowflake strategies are </w:t>
+      </w:r>
+      <w:r>
+        <w:rPr>
+          <w:b/>
+        </w:rPr>
+        <w:t>merge</w:t>
+      </w:r>
+      <w:r>
+        <w:t xml:space="preserve"> (default), </w:t>
+      </w:r>
+      <w:r>
+        <w:rPr>
+          <w:b/>
+        </w:rPr>
+        <w:t>append</w:t>
+      </w:r>
+      <w:r>
+        <w:t xml:space="preserve">, </w:t>
+      </w:r>
+      <w:r>
+        <w:rPr>
+          <w:b/>
+        </w:rPr>
+        <w:t>delete+insert</w:t>
+      </w:r>
+      <w:r>
+        <w:t xml:space="preserve"> (+ newer </w:t>
+      </w:r>
+      <w:r>
+        <w:rPr>
+          <w:b/>
+        </w:rPr>
+        <w:t>microbatch</w:t>
+      </w:r>
+      <w:r>
+        <w:t xml:space="preserve">) — ask the trainer which three he meant. </w:t>
       </w:r>
       <w:r>
         <w:rPr>
@@ -16474,7 +16537,7 @@
         <w:rPr>
           <w:i/>
         </w:rPr>
-        <w:t>He explicitly said ~3–4 exam questions come from this — prioritize it.</w:t>
+        <w:t>He said ~3–4 questions come from this (interview context — he never said "exam").</w:t>
       </w:r>
     </w:p>
     <w:p>
@@ -16743,10 +16806,10 @@
         <w:rPr>
           <w:b/>
         </w:rPr>
-        <w:t>⭐ EXAM SIGNAL:</w:t>
-      </w:r>
-      <w:r>
-        <w:t xml:space="preserve"> incremental = "3–4 questions," deep-dive next class. </w:t>
+        <w:t>⭐ Trainer flag:</w:t>
+      </w:r>
+      <w:r>
+        <w:t xml:space="preserve"> incremental = "3–4 questions" (interview context, not stated as exam); deep-dive next class. </w:t>
       </w:r>
       <w:r>
         <w:rPr>
@@ -16771,7 +16834,7 @@
         <w:rPr>
           <w:i/>
         </w:rPr>
-        <w:t>End of Class 36 notes. Mixed class: dbt macros (non-exam) + a solid incremental-load hands-on in Snowflake (watermark + MERGE, cert-relevant). Instructor explicitly flagged incremental as heavily tested (~3–4 questions) for next class.</w:t>
+        <w:t>End of Class 36 notes. Mixed class: dbt macros (non-exam) + a solid incremental-load hands-on in Snowflake (watermark + MERGE, cert-relevant). Instructor flagged incremental as "3–4 questions" (interview context — corrected; he never said exam).</w:t>
       </w:r>
     </w:p>
     <w:p>
@@ -16806,7 +16869,7 @@
         <w:rPr>
           <w:b/>
         </w:rPr>
-        <w:t>This is a GOOD class — the one the trainer flagged as exam-heavy, delivered.</w:t>
+        <w:t>This is a GOOD class — the incremental deep-dive the trainer flagged as "3–4 questions" (interview context — he never said exam).</w:t>
       </w:r>
       <w:r>
         <w:t xml:space="preserve"> It covers </w:t>
@@ -16896,10 +16959,10 @@
         <w:rPr>
           <w:b/>
         </w:rPr>
-        <w:t>~3–4 exam questions</w:t>
-      </w:r>
-      <w:r>
-        <w:t xml:space="preserve"> he warned about in Class 36. You also built this hands-on yourself, so it should feel familiar. </w:t>
+        <w:t>"3–4 questions"</w:t>
+      </w:r>
+      <w:r>
+        <w:t xml:space="preserve"> topic he flagged in Class 36 (interview, not stated as exam; the watermark+MERGE logic underneath does overlap the exam). You also built this hands-on yourself, so it should feel familiar. </w:t>
       </w:r>
       <w:r>
         <w:rPr>
@@ -17001,7 +17064,7 @@
         <w:pStyle w:val="Heading2"/>
       </w:pPr>
       <w:r>
-        <w:t>1. ⭐⭐⭐ Incremental models in dbt (the exam-flagged topic)</w:t>
+        <w:t>1. ⭐⭐⭐ Incremental models in dbt (trainer-flagged topic — interview; MERGE logic overlaps exam)</w:t>
       </w:r>
     </w:p>
     <w:p>
@@ -18448,7 +18511,7 @@
         <w:rPr>
           <w:i/>
         </w:rPr>
-        <w:t>End of Class 37 notes. Strong class: delivered the exam-flagged incremental deep-dive (is_incremental/{{this}}/MERGE + on_schema_change) and dbt tests (not_null/unique/accepted_values/relationships). You built incremental hands-on yourself this session, so it should stick.</w:t>
+        <w:t>End of Class 37 notes. Strong class: delivered the trainer-flagged (interview) incremental deep-dive (is_incremental/{{this}}/MERGE + on_schema_change) and dbt tests (not_null/unique/accepted_values/relationships). You built incremental hands-on yourself this session, so it should stick.</w:t>
       </w:r>
     </w:p>
     <w:p>
@@ -19082,7 +19145,7 @@
         <w:pStyle w:val="Heading2"/>
       </w:pPr>
       <w:r>
-        <w:t>2. ⭐⭐ The validation SQL dbt generates (trainer flagged as EXAM-askable)</w:t>
+        <w:t>2. ⭐⭐ The validation SQL dbt generates (trainer flagged: "they will ask… write a query to validate a FK / check constraint" — interview; also overlaps the exam's constraint-enforcement topic)</w:t>
       </w:r>
     </w:p>
     <w:p>
@@ -19609,7 +19672,7 @@
         <w:t>Know the validation SQL</w:t>
       </w:r>
       <w:r>
-        <w:t xml:space="preserve"> (trainer flagged as exam-askable): NULL check (</w:t>
+        <w:t xml:space="preserve"> (trainer flagged as askable — interview; constraint enforcement itself is exam material): NULL check (</w:t>
       </w:r>
       <w:r>
         <w:rPr>
@@ -19718,7 +19781,7 @@
         <w:rPr>
           <w:i/>
         </w:rPr>
-        <w:t>End of Class 38 notes. dbt tests deep-dive: the 4 generic tests (=constraints), custom business tests, and the underlying validation queries (trainer flagged the FK/CHECK validation SQL as exam-askable). This also covers the dbt-tests hands-on we had parked.</w:t>
+        <w:t>End of Class 38 notes. dbt tests deep-dive: the 4 generic tests (=constraints), custom business tests, and the underlying validation queries (trainer flagged the FK/CHECK validation SQL as interview-askable; constraint enforcement overlaps the exam). This also covers the dbt-tests hands-on we had parked.</w:t>
       </w:r>
     </w:p>
     <w:p>
@@ -20294,7 +20357,7 @@
         <w:pStyle w:val="Heading3"/>
       </w:pPr>
       <w:r>
-        <w:t>The two snapshot strategies ⭐ (exam-ish / interview)</w:t>
+        <w:t>The two snapshot strategies ⭐ (interview)</w:t>
       </w:r>
     </w:p>
     <w:tbl>

</xml_diff>